<commit_message>
docs(seguridad): guia decisores y reporte SIGAD/SIGASEN actualizados al cierre del 2.o ciclo (8 apps blindadas, PENT-001/002 cerrados, doble rotacion clave) + docx regenerados
</commit_message>
<xml_diff>
--- a/docs/NAC_2026_GGPD_REPORTE_SEGURIDAD_SIGAD_SIGASEN_V01.docx
+++ b/docs/NAC_2026_GGPD_REPORTE_SEGURIDAD_SIGAD_SIGASEN_V01.docx
@@ -951,20 +951,46 @@
         <w:rPr>
           <w:sz w:val="21"/>
         </w:rPr>
-        <w:t xml:space="preserve">4. Proponga un </w:t>
+        <w:t xml:space="preserve">4. Registre que la </w:t>
       </w:r>
       <w:r>
         <w:rPr>
           <w:b/>
           <w:sz w:val="21"/>
         </w:rPr>
-        <w:t>protocolo de prueba de penetración (pentest) independiente</w:t>
-      </w:r>
-      <w:r>
-        <w:rPr>
-          <w:sz w:val="21"/>
-        </w:rPr>
-        <w:t xml:space="preserve"> como siguiente fase formal, ante cualquier requerimiento institucional de evidencia ofensiva.</w:t>
+        <w:t>prueba de penetración (pentest)</w:t>
+      </w:r>
+      <w:r>
+        <w:rPr>
+          <w:sz w:val="21"/>
+        </w:rPr>
+        <w:t xml:space="preserve"> fue </w:t>
+      </w:r>
+      <w:r>
+        <w:rPr>
+          <w:b/>
+          <w:sz w:val="21"/>
+        </w:rPr>
+        <w:t>ejecutada y cerrada</w:t>
+      </w:r>
+      <w:r>
+        <w:rPr>
+          <w:sz w:val="21"/>
+        </w:rPr>
+        <w:t xml:space="preserve"> (PENT-001/002) y conserve el </w:t>
+      </w:r>
+      <w:r>
+        <w:rPr>
+          <w:b/>
+          <w:sz w:val="21"/>
+        </w:rPr>
+        <w:t>protocolo formal</w:t>
+      </w:r>
+      <w:r>
+        <w:rPr>
+          <w:sz w:val="21"/>
+        </w:rPr>
+        <w:t xml:space="preserve"> para extender el alcance y ejecutar retests.</w:t>
       </w:r>
     </w:p>
     <w:p>
@@ -1046,7 +1072,7 @@
           <w:color w:val="64748B"/>
           <w:sz w:val="21"/>
         </w:rPr>
-        <w:t xml:space="preserve"> bajo reglas de enfrentamiento no destructivas; sus hallazgos y veredictos se documentan por separado en </w:t>
+        <w:t xml:space="preserve"> bajo reglas de enfrentamiento no destructivas, en </w:t>
       </w:r>
       <w:r>
         <w:rPr>
@@ -1055,7 +1081,7 @@
           <w:color w:val="64748B"/>
           <w:sz w:val="21"/>
         </w:rPr>
-        <w:t>`NAC_2026_GGPD_PENTEST_SIGAD_SIGASEN_V01.md`</w:t>
+        <w:t>dos ciclos</w:t>
       </w:r>
       <w:r>
         <w:rPr>
@@ -1063,7 +1089,24 @@
           <w:color w:val="64748B"/>
           <w:sz w:val="21"/>
         </w:rPr>
-        <w:t xml:space="preserve"> (código </w:t>
+        <w:t xml:space="preserve">: </w:t>
+      </w:r>
+      <w:r>
+        <w:rPr>
+          <w:b/>
+          <w:i/>
+          <w:color w:val="64748B"/>
+          <w:sz w:val="21"/>
+        </w:rPr>
+        <w:t>`NAC_2026_GGPD_PENTEST_SIGAD_SIGASEN_V01.md`</w:t>
+      </w:r>
+      <w:r>
+        <w:rPr>
+          <w:i/>
+          <w:color w:val="64748B"/>
+          <w:sz w:val="21"/>
+        </w:rPr>
+        <w:t xml:space="preserve"> (</w:t>
       </w:r>
       <w:r>
         <w:rPr>
@@ -1080,7 +1123,58 @@
           <w:color w:val="64748B"/>
           <w:sz w:val="21"/>
         </w:rPr>
-        <w:t xml:space="preserve">). Este reporte </w:t>
+        <w:t xml:space="preserve">) y </w:t>
+      </w:r>
+      <w:r>
+        <w:rPr>
+          <w:b/>
+          <w:i/>
+          <w:color w:val="64748B"/>
+          <w:sz w:val="21"/>
+        </w:rPr>
+        <w:t>`NAC_2026_GGPD_PENTEST_SEIS_APPS_V01.md`</w:t>
+      </w:r>
+      <w:r>
+        <w:rPr>
+          <w:i/>
+          <w:color w:val="64748B"/>
+          <w:sz w:val="21"/>
+        </w:rPr>
+        <w:t xml:space="preserve"> (</w:t>
+      </w:r>
+      <w:r>
+        <w:rPr>
+          <w:rFonts w:ascii="Consolas" w:hAnsi="Consolas"/>
+          <w:i/>
+          <w:color w:val="64748B"/>
+          <w:sz w:val="21"/>
+        </w:rPr>
+        <w:t>GGPD-SGM-PENT-002</w:t>
+      </w:r>
+      <w:r>
+        <w:rPr>
+          <w:i/>
+          <w:color w:val="64748B"/>
+          <w:sz w:val="21"/>
+        </w:rPr>
+        <w:t xml:space="preserve">), ambos </w:t>
+      </w:r>
+      <w:r>
+        <w:rPr>
+          <w:b/>
+          <w:i/>
+          <w:color w:val="64748B"/>
+          <w:sz w:val="21"/>
+        </w:rPr>
+        <w:t>cerrados con remediación ejecutada</w:t>
+      </w:r>
+      <w:r>
+        <w:rPr>
+          <w:i/>
+          <w:color w:val="64748B"/>
+          <w:sz w:val="21"/>
+        </w:rPr>
+        <w:t xml:space="preserve">. Este reporte </w:t>
       </w:r>
       <w:r>
         <w:rPr>
@@ -1315,13 +1409,39 @@
           <w:b/>
           <w:sz w:val="21"/>
         </w:rPr>
-        <w:t>Fuera del alcance de este reporte:</w:t>
-      </w:r>
-      <w:r>
-        <w:rPr>
-          <w:sz w:val="21"/>
-        </w:rPr>
-        <w:t xml:space="preserve"> las 6 aplicaciones restantes del Repositorio Maestro (postura documentada por separado en </w:t>
+        <w:t>Aplicaciones complementarias:</w:t>
+      </w:r>
+      <w:r>
+        <w:rPr>
+          <w:sz w:val="21"/>
+        </w:rPr>
+        <w:t xml:space="preserve"> las 6 aplicaciones restantes (SIGI, SCTIS, SCMTP, SCPPE, SCEIN, SCGCC) recibieron el </w:t>
+      </w:r>
+      <w:r>
+        <w:rPr>
+          <w:b/>
+          <w:sz w:val="21"/>
+        </w:rPr>
+        <w:t>mismo blindaje el 12-10-2026</w:t>
+      </w:r>
+      <w:r>
+        <w:rPr>
+          <w:sz w:val="21"/>
+        </w:rPr>
+        <w:t xml:space="preserve"> (RLS — Migración 10, autenticación por RPC central, purga de secretos) y fueron </w:t>
+      </w:r>
+      <w:r>
+        <w:rPr>
+          <w:b/>
+          <w:sz w:val="21"/>
+        </w:rPr>
+        <w:t>verificadas con el pentest PENT-002</w:t>
+      </w:r>
+      <w:r>
+        <w:rPr>
+          <w:sz w:val="21"/>
+        </w:rPr>
+        <w:t xml:space="preserve">; postura consolidada en </w:t>
       </w:r>
       <w:r>
         <w:rPr>
@@ -1334,7 +1454,7 @@
         <w:rPr>
           <w:sz w:val="21"/>
         </w:rPr>
-        <w:t>).</w:t>
+        <w:t>.</w:t>
       </w:r>
     </w:p>
     <w:p>
@@ -2418,13 +2538,13 @@
           <w:b/>
           <w:sz w:val="21"/>
         </w:rPr>
-        <w:t>Rotación de la API key principal</w:t>
-      </w:r>
-      <w:r>
-        <w:rPr>
-          <w:sz w:val="21"/>
-        </w:rPr>
-        <w:t xml:space="preserve"> ejecutada con periodo de gracia de 72 horas (</w:t>
+        <w:t>Rotación de la API key principal (2 ciclos, 12-10-2026):</w:t>
+      </w:r>
+      <w:r>
+        <w:rPr>
+          <w:sz w:val="21"/>
+        </w:rPr>
+        <w:t xml:space="preserve"> (1.º) tras el pentest de SIGAD/SIGA-SEN, clave anterior con gracia hasta el 2026-10-15T22:01Z; (2.º) tras el pentest de las 6 apps restantes (</w:t>
       </w:r>
       <w:r>
         <w:rPr>
@@ -2437,20 +2557,46 @@
         <w:rPr>
           <w:sz w:val="21"/>
         </w:rPr>
-        <w:t xml:space="preserve">): clave nueva activa; clave anterior expira el </w:t>
+        <w:t xml:space="preserve">), al detectarse la clave </w:t>
+      </w:r>
+      <w:r>
+        <w:rPr>
+          <w:rFonts w:ascii="Consolas" w:hAnsi="Consolas"/>
+          <w:sz w:val="21"/>
+        </w:rPr>
+        <w:t>ik_985b…</w:t>
+      </w:r>
+      <w:r>
+        <w:rPr>
+          <w:sz w:val="21"/>
+        </w:rPr>
+        <w:t xml:space="preserve"> embebida en bundles — clave nueva activa; la anterior expira el </w:t>
       </w:r>
       <w:r>
         <w:rPr>
           <w:b/>
           <w:sz w:val="21"/>
         </w:rPr>
-        <w:t>2026-10-15T22:01:33Z</w:t>
-      </w:r>
-      <w:r>
-        <w:rPr>
-          <w:sz w:val="21"/>
-        </w:rPr>
-        <w:t xml:space="preserve"> (cero caídas por superposición).</w:t>
+        <w:t>2026-10-15T23:45:36Z</w:t>
+      </w:r>
+      <w:r>
+        <w:rPr>
+          <w:sz w:val="21"/>
+        </w:rPr>
+        <w:t xml:space="preserve"> (cero caídas por superposición). Los bundles de las 8 apps quedaron reconstruidos con la </w:t>
+      </w:r>
+      <w:r>
+        <w:rPr>
+          <w:rFonts w:ascii="Consolas" w:hAnsi="Consolas"/>
+          <w:sz w:val="21"/>
+        </w:rPr>
+        <w:t>ANON_KEY</w:t>
+      </w:r>
+      <w:r>
+        <w:rPr>
+          <w:sz w:val="21"/>
+        </w:rPr>
+        <w:t xml:space="preserve"> pública.</w:t>
       </w:r>
     </w:p>
     <w:p>
@@ -5410,7 +5556,7 @@
           <w:color w:val="64748B"/>
           <w:sz w:val="21"/>
         </w:rPr>
-        <w:t>El ciclo ofensivo (pentest) fue ejecutado el 12-10-2026</w:t>
+        <w:t>Ambos ciclos ofensivos (PENT-001 y PENT-002) fueron ejecutados el 12-10-2026</w:t>
       </w:r>
       <w:r>
         <w:rPr>
@@ -5418,7 +5564,41 @@
           <w:color w:val="64748B"/>
           <w:sz w:val="21"/>
         </w:rPr>
-        <w:t xml:space="preserve"> bajo autorización y RoE no destructivas: véase </w:t>
+        <w:t xml:space="preserve"> bajo autorización y RoE no destructivas: véanse </w:t>
+      </w:r>
+      <w:r>
+        <w:rPr>
+          <w:rFonts w:ascii="Consolas" w:hAnsi="Consolas"/>
+          <w:i/>
+          <w:color w:val="64748B"/>
+          <w:sz w:val="21"/>
+        </w:rPr>
+        <w:t>NAC_2026_GGPD_PENTEST_SIGAD_SIGASEN_V01.md</w:t>
+      </w:r>
+      <w:r>
+        <w:rPr>
+          <w:i/>
+          <w:color w:val="64748B"/>
+          <w:sz w:val="21"/>
+        </w:rPr>
+        <w:t xml:space="preserve"> y </w:t>
+      </w:r>
+      <w:r>
+        <w:rPr>
+          <w:rFonts w:ascii="Consolas" w:hAnsi="Consolas"/>
+          <w:i/>
+          <w:color w:val="64748B"/>
+          <w:sz w:val="21"/>
+        </w:rPr>
+        <w:t>NAC_2026_GGPD_PENTEST_SEIS_APPS_V01.md</w:t>
+      </w:r>
+      <w:r>
+        <w:rPr>
+          <w:i/>
+          <w:color w:val="64748B"/>
+          <w:sz w:val="21"/>
+        </w:rPr>
+        <w:t xml:space="preserve">. La Sección 9 conserva el protocolo estándar para </w:t>
       </w:r>
       <w:r>
         <w:rPr>
@@ -5427,7 +5607,7 @@
           <w:color w:val="64748B"/>
           <w:sz w:val="21"/>
         </w:rPr>
-        <w:t>`NAC_2026_GGPD_PENTEST_SIGAD_SIGASEN_V01.md`</w:t>
+        <w:t>extender</w:t>
       </w:r>
       <w:r>
         <w:rPr>
@@ -5435,24 +5615,7 @@
           <w:color w:val="64748B"/>
           <w:sz w:val="21"/>
         </w:rPr>
-        <w:t xml:space="preserve">. La Sección 9 conserva el protocolo estándar para </w:t>
-      </w:r>
-      <w:r>
-        <w:rPr>
-          <w:b/>
-          <w:i/>
-          <w:color w:val="64748B"/>
-          <w:sz w:val="21"/>
-        </w:rPr>
-        <w:t>extender</w:t>
-      </w:r>
-      <w:r>
-        <w:rPr>
-          <w:i/>
-          <w:color w:val="64748B"/>
-          <w:sz w:val="21"/>
-        </w:rPr>
-        <w:t xml:space="preserve"> el pentest (otras apps, cuentas desechables, retest).</w:t>
+        <w:t xml:space="preserve"> el pentest (backend SCTIS, cuentas desechables para bloqueo, retest).</w:t>
       </w:r>
     </w:p>
     <w:p>
@@ -5925,7 +6088,7 @@
               <w:rPr>
                 <w:sz w:val="18"/>
               </w:rPr>
-              <w:t>✅ Parcial</w:t>
+              <w:t>✅ Implementado</w:t>
             </w:r>
           </w:p>
         </w:tc>
@@ -5948,7 +6111,7 @@
               <w:rPr>
                 <w:sz w:val="18"/>
               </w:rPr>
-              <w:t>CSP, sin XSS por DOM, 0 vulns npm; pendiente pentest (Secc. 9)</w:t>
+              <w:t>CSP, sin XSS por DOM, 0 vulns npm; pentest ejecutado (PENT-001/002) y cerrado (Secc. 9)</w:t>
             </w:r>
           </w:p>
         </w:tc>
@@ -6149,7 +6312,20 @@
         <w:rPr>
           <w:sz w:val="21"/>
         </w:rPr>
-        <w:t xml:space="preserve"> (OWASP ASVS v4.0 Level 2 alcanzado en autenticación, sesión, control de acceso, validación y configuración), con dos controles pendientes de entornos externos (cabeceras HTTP a nivel hosting y pentest independiente).</w:t>
+        <w:t xml:space="preserve"> (OWASP ASVS v4.0 Level 2 alcanzado en autenticación, sesión, control de acceso, validación y configuración) en las </w:t>
+      </w:r>
+      <w:r>
+        <w:rPr>
+          <w:b/>
+          <w:sz w:val="21"/>
+        </w:rPr>
+        <w:t>8 aplicaciones</w:t>
+      </w:r>
+      <w:r>
+        <w:rPr>
+          <w:sz w:val="21"/>
+        </w:rPr>
+        <w:t xml:space="preserve"> del Repositorio. Controles pendientes de entornos externos: cabeceras CORS a nivel InsForge (H-PT-01) y rotación de la clave del proyecto BCI (H-PT-07).</w:t>
       </w:r>
     </w:p>
     <w:p>
@@ -6245,13 +6421,26 @@
           <w:b/>
           <w:sz w:val="21"/>
         </w:rPr>
-        <w:t>Pentest independiente no ejecutado (R2, MEDIO-PLANIFICADO):</w:t>
-      </w:r>
-      <w:r>
-        <w:rPr>
-          <w:sz w:val="21"/>
-        </w:rPr>
-        <w:t xml:space="preserve"> pendiente de autorización y protocolo formal (Sección 9). No hay evidencia ofensiva fabricada.</w:t>
+        <w:t>Pentest ejecutado (R2, RESUELTO 12-10-2026):</w:t>
+      </w:r>
+      <w:r>
+        <w:rPr>
+          <w:sz w:val="21"/>
+        </w:rPr>
+        <w:t xml:space="preserve"> dos ciclos autorizados y no destructivos (PENT-001 SIGAD/SIGA-SEN y PENT-002 seis apps restantes), ambos </w:t>
+      </w:r>
+      <w:r>
+        <w:rPr>
+          <w:b/>
+          <w:sz w:val="21"/>
+        </w:rPr>
+        <w:t>cerrados con remediación</w:t>
+      </w:r>
+      <w:r>
+        <w:rPr>
+          <w:sz w:val="21"/>
+        </w:rPr>
+        <w:t>. Residuales: CORS reflectante (H-PT-01, requiere configuración en InsForge) y clave del proyecto BCI (H-PT-07, tercero).</w:t>
       </w:r>
     </w:p>
     <w:p>
@@ -6458,13 +6647,52 @@
           <w:b/>
           <w:sz w:val="21"/>
         </w:rPr>
-        <w:t>antes del 2026-10-15T22:01Z</w:t>
-      </w:r>
-      <w:r>
-        <w:rPr>
-          <w:sz w:val="21"/>
-        </w:rPr>
-        <w:t xml:space="preserve"> (ver reporte de las 8 apps).</w:t>
+        <w:t>antes del 2026-10-15T23:45:36Z</w:t>
+      </w:r>
+      <w:r>
+        <w:rPr>
+          <w:sz w:val="21"/>
+        </w:rPr>
+        <w:t xml:space="preserve"> (fin de la gracia de la 2.ª rotación). Conserva endurecimiento pendiente (</w:t>
+      </w:r>
+      <w:r>
+        <w:rPr>
+          <w:rFonts w:ascii="Consolas" w:hAnsi="Consolas"/>
+          <w:sz w:val="21"/>
+        </w:rPr>
+        <w:t>config.py</w:t>
+      </w:r>
+      <w:r>
+        <w:rPr>
+          <w:sz w:val="21"/>
+        </w:rPr>
+        <w:t xml:space="preserve">, </w:t>
+      </w:r>
+      <w:r>
+        <w:rPr>
+          <w:rFonts w:ascii="Consolas" w:hAnsi="Consolas"/>
+          <w:sz w:val="21"/>
+        </w:rPr>
+        <w:t>auth.py</w:t>
+      </w:r>
+      <w:r>
+        <w:rPr>
+          <w:sz w:val="21"/>
+        </w:rPr>
+        <w:t xml:space="preserve">, </w:t>
+      </w:r>
+      <w:r>
+        <w:rPr>
+          <w:rFonts w:ascii="Consolas" w:hAnsi="Consolas"/>
+          <w:sz w:val="21"/>
+        </w:rPr>
+        <w:t>db.py</w:t>
+      </w:r>
+      <w:r>
+        <w:rPr>
+          <w:sz w:val="21"/>
+        </w:rPr>
+        <w:t>) documentado en el PENT-002.</w:t>
       </w:r>
     </w:p>
     <w:p>
@@ -6660,6 +6888,43 @@
     </w:p>
     <w:p>
       <w:pPr>
+        <w:spacing w:after="120"/>
+      </w:pPr>
+      <w:r>
+        <w:rPr>
+          <w:sz w:val="21"/>
+        </w:rPr>
+        <w:t xml:space="preserve">5. </w:t>
+      </w:r>
+      <w:r>
+        <w:rPr>
+          <w:b/>
+          <w:sz w:val="21"/>
+        </w:rPr>
+        <w:t>Rotación de la clave del proyecto BCI (R7, tercero):</w:t>
+      </w:r>
+      <w:r>
+        <w:rPr>
+          <w:sz w:val="21"/>
+        </w:rPr>
+        <w:t xml:space="preserve"> la instancia de la Base de Conocimiento Inteligente (</w:t>
+      </w:r>
+      <w:r>
+        <w:rPr>
+          <w:rFonts w:ascii="Consolas" w:hAnsi="Consolas"/>
+          <w:sz w:val="21"/>
+        </w:rPr>
+        <w:t>jd3uejbz</w:t>
+      </w:r>
+      <w:r>
+        <w:rPr>
+          <w:sz w:val="21"/>
+        </w:rPr>
+        <w:t>) tuvo una clave embebida en SIGI (H-PT-07); coordinar su rotación con el propietario del proyecto.</w:t>
+      </w:r>
+    </w:p>
+    <w:p>
+      <w:pPr>
         <w:pStyle w:val="Heading2"/>
         <w:spacing w:before="120" w:after="80"/>
       </w:pPr>
@@ -6680,20 +6945,12 @@
       </w:pPr>
       <w:r>
         <w:rPr>
-          <w:i/>
-          <w:color w:val="64748B"/>
-          <w:sz w:val="21"/>
-        </w:rPr>
-        <w:t xml:space="preserve">El </w:t>
-      </w:r>
-      <w:r>
-        <w:rPr>
           <w:b/>
           <w:i/>
           <w:color w:val="64748B"/>
           <w:sz w:val="21"/>
         </w:rPr>
-        <w:t>primer ciclo de pentest fue ejecutado y autorizado por la GGPD</w:t>
+        <w:t>Dos ciclos de pentest fueron ejecutados y autorizados por la GGPD</w:t>
       </w:r>
       <w:r>
         <w:rPr>
@@ -6701,7 +6958,7 @@
           <w:color w:val="64748B"/>
           <w:sz w:val="21"/>
         </w:rPr>
-        <w:t xml:space="preserve"> el 12-10-2026 (no destructivo, vector externo). Hallazgos y veredictos en </w:t>
+        <w:t xml:space="preserve"> el 12-10-2026 (no destructivos, vector externo): </w:t>
       </w:r>
       <w:r>
         <w:rPr>
@@ -6710,7 +6967,7 @@
           <w:color w:val="64748B"/>
           <w:sz w:val="21"/>
         </w:rPr>
-        <w:t>`NAC_2026_GGPD_PENTEST_SIGAD_SIGASEN_V01.md`</w:t>
+        <w:t>PENT-001</w:t>
       </w:r>
       <w:r>
         <w:rPr>
@@ -6718,7 +6975,7 @@
           <w:color w:val="64748B"/>
           <w:sz w:val="21"/>
         </w:rPr>
-        <w:t xml:space="preserve"> (H-PT-01…H-PT-05, CVSS v3.1, plan de retest). El protocolo estándar siguiente rige para </w:t>
+        <w:t xml:space="preserve"> (SIGAD/SIGA-SEN, H-PT-01…H-PT-05) y </w:t>
       </w:r>
       <w:r>
         <w:rPr>
@@ -6727,7 +6984,7 @@
           <w:color w:val="64748B"/>
           <w:sz w:val="21"/>
         </w:rPr>
-        <w:t>extender</w:t>
+        <w:t>PENT-002</w:t>
       </w:r>
       <w:r>
         <w:rPr>
@@ -6735,7 +6992,41 @@
           <w:color w:val="64748B"/>
           <w:sz w:val="21"/>
         </w:rPr>
-        <w:t xml:space="preserve"> el alcance (otras 6 apps, cuentas desechables para bloqueo, retests):</w:t>
+        <w:t xml:space="preserve"> (las 6 apps restantes, H-PT-06…H-PT-12). Ambos </w:t>
+      </w:r>
+      <w:r>
+        <w:rPr>
+          <w:b/>
+          <w:i/>
+          <w:color w:val="64748B"/>
+          <w:sz w:val="21"/>
+        </w:rPr>
+        <w:t>cerrados con remediación ejecutada</w:t>
+      </w:r>
+      <w:r>
+        <w:rPr>
+          <w:i/>
+          <w:color w:val="64748B"/>
+          <w:sz w:val="21"/>
+        </w:rPr>
+        <w:t xml:space="preserve"> (RLS, autenticación RPC central, purga de secretos y rotación de la clave de servicio). El protocolo estándar siguiente rige para </w:t>
+      </w:r>
+      <w:r>
+        <w:rPr>
+          <w:b/>
+          <w:i/>
+          <w:color w:val="64748B"/>
+          <w:sz w:val="21"/>
+        </w:rPr>
+        <w:t>extender</w:t>
+      </w:r>
+      <w:r>
+        <w:rPr>
+          <w:i/>
+          <w:color w:val="64748B"/>
+          <w:sz w:val="21"/>
+        </w:rPr>
+        <w:t xml:space="preserve"> el alcance (backend SCTIS, cuentas desechables para bloqueo, retests):</w:t>
       </w:r>
     </w:p>
     <w:tbl>

</xml_diff>